<commit_message>
[2026-03-28] : .\{root} : Updated readme based on current state
</commit_message>
<xml_diff>
--- a/Semester_1/assignment-primary/front_page.docx
+++ b/Semester_1/assignment-primary/front_page.docx
@@ -339,7 +339,7 @@
           <w:szCs w:val="32"/>
           <w:lang w:val="en-US"/>
         </w:rPr>
-        <w:t xml:space="preserve">   </w:t>
+        <w:t xml:space="preserve"> </w:t>
       </w:r>
       <w:r>
         <w:rPr>
@@ -388,12 +388,25 @@
       <w:r>
         <w:rPr>
           <w:rFonts w:ascii="Times New Roman" w:hAnsi="Times New Roman" w:cs="Times New Roman"/>
+          <w:b/>
+          <w:bCs/>
+          <w:sz w:val="40"/>
+          <w:szCs w:val="40"/>
+          <w:lang w:val="en-US"/>
+        </w:rPr>
+        <w:t xml:space="preserve">   </w:t>
+      </w:r>
+      <w:proofErr w:type="spellStart"/>
+      <w:r>
+        <w:rPr>
+          <w:rFonts w:ascii="Times New Roman" w:hAnsi="Times New Roman" w:cs="Times New Roman"/>
           <w:sz w:val="32"/>
           <w:szCs w:val="32"/>
           <w:lang w:val="en-US"/>
         </w:rPr>
         <w:t>ABC12345H</w:t>
       </w:r>
+      <w:proofErr w:type="spellEnd"/>
     </w:p>
     <w:p>
       <w:pPr>
@@ -416,7 +429,7 @@
           <w:szCs w:val="32"/>
           <w:lang w:val="en-US"/>
         </w:rPr>
-        <w:t xml:space="preserve">   </w:t>
+        <w:t xml:space="preserve"> </w:t>
       </w:r>
       <w:r>
         <w:rPr>
@@ -472,6 +485,17 @@
           <w:lang w:val="en-US"/>
         </w:rPr>
         <w:tab/>
+      </w:r>
+      <w:r>
+        <w:rPr>
+          <w:rFonts w:ascii="Times New Roman" w:hAnsi="Times New Roman" w:cs="Times New Roman"/>
+          <w:b/>
+          <w:bCs/>
+          <w:sz w:val="32"/>
+          <w:szCs w:val="32"/>
+          <w:lang w:val="en-US"/>
+        </w:rPr>
+        <w:t xml:space="preserve">    </w:t>
       </w:r>
       <w:r>
         <w:rPr>
@@ -513,7 +537,7 @@
           <w:szCs w:val="32"/>
           <w:lang w:val="en-US"/>
         </w:rPr>
-        <w:t xml:space="preserve">   </w:t>
+        <w:t xml:space="preserve"> </w:t>
       </w:r>
       <w:r>
         <w:rPr>
@@ -547,6 +571,17 @@
           <w:lang w:val="en-US"/>
         </w:rPr>
         <w:tab/>
+      </w:r>
+      <w:r>
+        <w:rPr>
+          <w:rFonts w:ascii="Times New Roman" w:hAnsi="Times New Roman" w:cs="Times New Roman"/>
+          <w:b/>
+          <w:bCs/>
+          <w:sz w:val="40"/>
+          <w:szCs w:val="40"/>
+          <w:lang w:val="en-US"/>
+        </w:rPr>
+        <w:t xml:space="preserve">   </w:t>
       </w:r>
       <w:r>
         <w:rPr>
@@ -579,7 +614,7 @@
           <w:szCs w:val="32"/>
           <w:lang w:val="en-US"/>
         </w:rPr>
-        <w:t xml:space="preserve">   </w:t>
+        <w:t xml:space="preserve"> </w:t>
       </w:r>
       <w:r>
         <w:rPr>
@@ -620,6 +655,15 @@
           <w:lang w:val="en-US"/>
         </w:rPr>
         <w:tab/>
+      </w:r>
+      <w:r>
+        <w:rPr>
+          <w:rFonts w:ascii="Times New Roman" w:hAnsi="Times New Roman" w:cs="Times New Roman"/>
+          <w:sz w:val="32"/>
+          <w:szCs w:val="32"/>
+          <w:lang w:val="en-US"/>
+        </w:rPr>
+        <w:t xml:space="preserve">    </w:t>
       </w:r>
       <w:r>
         <w:rPr>
@@ -651,7 +695,7 @@
           <w:szCs w:val="32"/>
           <w:lang w:val="en-US"/>
         </w:rPr>
-        <w:t xml:space="preserve">   </w:t>
+        <w:t xml:space="preserve"> </w:t>
       </w:r>
       <w:r>
         <w:rPr>
@@ -663,6 +707,17 @@
           <w:lang w:val="en-US"/>
         </w:rPr>
         <w:t>PAPER</w:t>
+      </w:r>
+      <w:r>
+        <w:rPr>
+          <w:rFonts w:ascii="Times New Roman" w:hAnsi="Times New Roman" w:cs="Times New Roman"/>
+          <w:b/>
+          <w:bCs/>
+          <w:sz w:val="32"/>
+          <w:szCs w:val="32"/>
+          <w:lang w:val="en-US"/>
+        </w:rPr>
+        <w:t xml:space="preserve"> CODE</w:t>
       </w:r>
       <w:r>
         <w:rPr>
@@ -682,17 +737,9 @@
           <w:szCs w:val="32"/>
           <w:lang w:val="en-US"/>
         </w:rPr>
-        <w:t xml:space="preserve"> </w:t>
-      </w:r>
-      <w:r>
-        <w:rPr>
-          <w:rFonts w:ascii="Times New Roman" w:hAnsi="Times New Roman" w:cs="Times New Roman"/>
-          <w:sz w:val="32"/>
-          <w:szCs w:val="32"/>
-          <w:lang w:val="en-US"/>
-        </w:rPr>
-        <w:tab/>
-      </w:r>
+        <w:t xml:space="preserve">   </w:t>
+      </w:r>
+      <w:proofErr w:type="spellStart"/>
       <w:r>
         <w:rPr>
           <w:rFonts w:ascii="Cascadia Code" w:hAnsi="Cascadia Code" w:cs="Cascadia Code"/>
@@ -701,6 +748,7 @@
         </w:rPr>
         <w:t>CMSDSC101P</w:t>
       </w:r>
+      <w:proofErr w:type="spellEnd"/>
     </w:p>
     <w:p>
       <w:pPr>
@@ -722,17 +770,17 @@
           <w:sz w:val="32"/>
           <w:szCs w:val="32"/>
         </w:rPr>
-        <w:t xml:space="preserve">   </w:t>
-      </w:r>
-      <w:r>
-        <w:rPr>
-          <w:rFonts w:ascii="Times New Roman" w:hAnsi="Times New Roman" w:cs="Times New Roman"/>
-          <w:b/>
-          <w:bCs/>
-          <w:sz w:val="32"/>
-          <w:szCs w:val="32"/>
-        </w:rPr>
-        <w:t>YEAR</w:t>
+        <w:t xml:space="preserve"> </w:t>
+      </w:r>
+      <w:r>
+        <w:rPr>
+          <w:rFonts w:ascii="Times New Roman" w:hAnsi="Times New Roman" w:cs="Times New Roman"/>
+          <w:b/>
+          <w:bCs/>
+          <w:sz w:val="32"/>
+          <w:szCs w:val="32"/>
+        </w:rPr>
+        <w:t>SESSION</w:t>
       </w:r>
       <w:r>
         <w:rPr>
@@ -759,30 +807,47 @@
           <w:szCs w:val="32"/>
         </w:rPr>
         <w:tab/>
-      </w:r>
-      <w:r>
-        <w:rPr>
-          <w:rFonts w:ascii="Times New Roman" w:hAnsi="Times New Roman" w:cs="Times New Roman"/>
-          <w:sz w:val="32"/>
-          <w:szCs w:val="32"/>
-        </w:rPr>
-        <w:tab/>
-      </w:r>
-      <w:r>
-        <w:rPr>
-          <w:rFonts w:ascii="Times New Roman" w:hAnsi="Times New Roman" w:cs="Times New Roman"/>
-          <w:sz w:val="32"/>
-          <w:szCs w:val="32"/>
-        </w:rPr>
-        <w:t>2025- 202</w:t>
-      </w:r>
-      <w:r>
-        <w:rPr>
-          <w:rFonts w:ascii="Times New Roman" w:hAnsi="Times New Roman" w:cs="Times New Roman"/>
-          <w:sz w:val="32"/>
-          <w:szCs w:val="32"/>
-        </w:rPr>
-        <w:t>9</w:t>
+        <w:t xml:space="preserve">    </w:t>
+      </w:r>
+      <w:r>
+        <w:rPr>
+          <w:rFonts w:ascii="Times New Roman" w:hAnsi="Times New Roman" w:cs="Times New Roman"/>
+          <w:sz w:val="32"/>
+          <w:szCs w:val="32"/>
+        </w:rPr>
+        <w:t>2025</w:t>
+      </w:r>
+      <w:r>
+        <w:rPr>
+          <w:rFonts w:ascii="Times New Roman" w:hAnsi="Times New Roman" w:cs="Times New Roman"/>
+          <w:sz w:val="32"/>
+          <w:szCs w:val="32"/>
+        </w:rPr>
+        <w:t xml:space="preserve"> –</w:t>
+      </w:r>
+      <w:r>
+        <w:rPr>
+          <w:rFonts w:ascii="Times New Roman" w:hAnsi="Times New Roman" w:cs="Times New Roman"/>
+          <w:sz w:val="32"/>
+          <w:szCs w:val="32"/>
+        </w:rPr>
+        <w:t xml:space="preserve"> 202</w:t>
+      </w:r>
+      <w:r>
+        <w:rPr>
+          <w:rFonts w:ascii="Times New Roman" w:hAnsi="Times New Roman" w:cs="Times New Roman"/>
+          <w:sz w:val="32"/>
+          <w:szCs w:val="32"/>
+        </w:rPr>
+        <w:t>6</w:t>
+      </w:r>
+      <w:r>
+        <w:rPr>
+          <w:rFonts w:ascii="Times New Roman" w:hAnsi="Times New Roman" w:cs="Times New Roman"/>
+          <w:sz w:val="32"/>
+          <w:szCs w:val="32"/>
+        </w:rPr>
+        <w:t xml:space="preserve"> </w:t>
       </w:r>
     </w:p>
     <w:sectPr>

</xml_diff>

<commit_message>
[2026-05-13] : .\assignment-primary : Updated assignment files
</commit_message>
<xml_diff>
--- a/Semester_1/assignment-primary/front_page.docx
+++ b/Semester_1/assignment-primary/front_page.docx
@@ -167,7 +167,7 @@
           <w:noProof/>
         </w:rPr>
         <w:drawing>
-          <wp:anchor distT="0" distB="0" distL="114300" distR="114300" simplePos="0" relativeHeight="251658240" behindDoc="0" locked="0" layoutInCell="1" allowOverlap="1" wp14:anchorId="5C3BB04D" wp14:editId="3F67AC8D">
+          <wp:anchor distT="0" distB="0" distL="114300" distR="114300" simplePos="0" relativeHeight="251658240" behindDoc="0" locked="0" layoutInCell="1" allowOverlap="1" wp14:anchorId="5C3BB04D" wp14:editId="31B0A3C5">
             <wp:simplePos x="0" y="0"/>
             <wp:positionH relativeFrom="margin">
               <wp:posOffset>1551305</wp:posOffset>
@@ -396,17 +396,15 @@
         </w:rPr>
         <w:t xml:space="preserve">   </w:t>
       </w:r>
-      <w:proofErr w:type="spellStart"/>
-      <w:r>
-        <w:rPr>
-          <w:rFonts w:ascii="Times New Roman" w:hAnsi="Times New Roman" w:cs="Times New Roman"/>
-          <w:sz w:val="32"/>
-          <w:szCs w:val="32"/>
-          <w:lang w:val="en-US"/>
-        </w:rPr>
-        <w:t>ABC12345H</w:t>
-      </w:r>
-      <w:proofErr w:type="spellEnd"/>
+      <w:r>
+        <w:rPr>
+          <w:rFonts w:ascii="Times New Roman" w:hAnsi="Times New Roman" w:cs="Times New Roman"/>
+          <w:sz w:val="32"/>
+          <w:szCs w:val="32"/>
+          <w:lang w:val="en-US"/>
+        </w:rPr>
+        <w:t>1261113</w:t>
+      </w:r>
     </w:p>
     <w:p>
       <w:pPr>
@@ -504,16 +502,7 @@
           <w:szCs w:val="32"/>
           <w:lang w:val="en-US"/>
         </w:rPr>
-        <w:t>0</w:t>
-      </w:r>
-      <w:r>
-        <w:rPr>
-          <w:rFonts w:ascii="Times New Roman" w:hAnsi="Times New Roman" w:cs="Times New Roman"/>
-          <w:sz w:val="32"/>
-          <w:szCs w:val="32"/>
-          <w:lang w:val="en-US"/>
-        </w:rPr>
-        <w:t>3250</w:t>
+        <w:t>06493</w:t>
       </w:r>
     </w:p>
     <w:p>
@@ -586,11 +575,11 @@
       <w:r>
         <w:rPr>
           <w:rFonts w:ascii="Times New Roman" w:hAnsi="Times New Roman" w:cs="Times New Roman"/>
-          <w:sz w:val="32"/>
-          <w:szCs w:val="32"/>
-          <w:lang w:val="en-US"/>
-        </w:rPr>
-        <w:t>101105465648654</w:t>
+          <w:sz w:val="40"/>
+          <w:szCs w:val="40"/>
+          <w:lang w:val="en-US"/>
+        </w:rPr>
+        <w:t>101251016000437</w:t>
       </w:r>
     </w:p>
     <w:p>
@@ -739,7 +728,6 @@
         </w:rPr>
         <w:t xml:space="preserve">   </w:t>
       </w:r>
-      <w:proofErr w:type="spellStart"/>
       <w:r>
         <w:rPr>
           <w:rFonts w:ascii="Cascadia Code" w:hAnsi="Cascadia Code" w:cs="Cascadia Code"/>
@@ -748,7 +736,6 @@
         </w:rPr>
         <w:t>CMSDSC101P</w:t>
       </w:r>
-      <w:proofErr w:type="spellEnd"/>
     </w:p>
     <w:p>
       <w:pPr>
@@ -1399,7 +1386,7 @@
       <w:rFonts w:eastAsiaTheme="majorEastAsia" w:cstheme="majorBidi"/>
       <w:i/>
       <w:iCs/>
-      <w:color w:val="595959" w:themeColor="text1" w:themeTint="A6"/>
+      <w:color w:val="D9D9D9" w:themeColor="text1" w:themeTint="A6"/>
     </w:rPr>
   </w:style>
   <w:style w:type="paragraph" w:styleId="Heading7">
@@ -1420,7 +1407,7 @@
     </w:pPr>
     <w:rPr>
       <w:rFonts w:eastAsiaTheme="majorEastAsia" w:cstheme="majorBidi"/>
-      <w:color w:val="595959" w:themeColor="text1" w:themeTint="A6"/>
+      <w:color w:val="D9D9D9" w:themeColor="text1" w:themeTint="A6"/>
     </w:rPr>
   </w:style>
   <w:style w:type="paragraph" w:styleId="Heading8">
@@ -1443,7 +1430,7 @@
       <w:rFonts w:eastAsiaTheme="majorEastAsia" w:cstheme="majorBidi"/>
       <w:i/>
       <w:iCs/>
-      <w:color w:val="272727" w:themeColor="text1" w:themeTint="D8"/>
+      <w:color w:val="CECECE" w:themeColor="text1" w:themeTint="D8"/>
     </w:rPr>
   </w:style>
   <w:style w:type="paragraph" w:styleId="Heading9">
@@ -1464,7 +1451,7 @@
     </w:pPr>
     <w:rPr>
       <w:rFonts w:eastAsiaTheme="majorEastAsia" w:cstheme="majorBidi"/>
-      <w:color w:val="272727" w:themeColor="text1" w:themeTint="D8"/>
+      <w:color w:val="CECECE" w:themeColor="text1" w:themeTint="D8"/>
     </w:rPr>
   </w:style>
   <w:style w:type="character" w:default="1" w:styleId="DefaultParagraphFont">
@@ -1572,7 +1559,7 @@
       <w:rFonts w:eastAsiaTheme="majorEastAsia" w:cstheme="majorBidi"/>
       <w:i/>
       <w:iCs/>
-      <w:color w:val="595959" w:themeColor="text1" w:themeTint="A6"/>
+      <w:color w:val="D9D9D9" w:themeColor="text1" w:themeTint="A6"/>
     </w:rPr>
   </w:style>
   <w:style w:type="character" w:customStyle="1" w:styleId="Heading7Char">
@@ -1584,7 +1571,7 @@
     <w:rsid w:val="00420378"/>
     <w:rPr>
       <w:rFonts w:eastAsiaTheme="majorEastAsia" w:cstheme="majorBidi"/>
-      <w:color w:val="595959" w:themeColor="text1" w:themeTint="A6"/>
+      <w:color w:val="D9D9D9" w:themeColor="text1" w:themeTint="A6"/>
     </w:rPr>
   </w:style>
   <w:style w:type="character" w:customStyle="1" w:styleId="Heading8Char">
@@ -1598,7 +1585,7 @@
       <w:rFonts w:eastAsiaTheme="majorEastAsia" w:cstheme="majorBidi"/>
       <w:i/>
       <w:iCs/>
-      <w:color w:val="272727" w:themeColor="text1" w:themeTint="D8"/>
+      <w:color w:val="CECECE" w:themeColor="text1" w:themeTint="D8"/>
     </w:rPr>
   </w:style>
   <w:style w:type="character" w:customStyle="1" w:styleId="Heading9Char">
@@ -1610,7 +1597,7 @@
     <w:rsid w:val="00420378"/>
     <w:rPr>
       <w:rFonts w:eastAsiaTheme="majorEastAsia" w:cstheme="majorBidi"/>
-      <w:color w:val="272727" w:themeColor="text1" w:themeTint="D8"/>
+      <w:color w:val="CECECE" w:themeColor="text1" w:themeTint="D8"/>
     </w:rPr>
   </w:style>
   <w:style w:type="paragraph" w:styleId="Title">
@@ -1662,7 +1649,7 @@
     </w:pPr>
     <w:rPr>
       <w:rFonts w:eastAsiaTheme="majorEastAsia" w:cstheme="majorBidi"/>
-      <w:color w:val="595959" w:themeColor="text1" w:themeTint="A6"/>
+      <w:color w:val="D9D9D9" w:themeColor="text1" w:themeTint="A6"/>
       <w:spacing w:val="15"/>
       <w:sz w:val="28"/>
       <w:szCs w:val="28"/>
@@ -1676,7 +1663,7 @@
     <w:rsid w:val="00420378"/>
     <w:rPr>
       <w:rFonts w:eastAsiaTheme="majorEastAsia" w:cstheme="majorBidi"/>
-      <w:color w:val="595959" w:themeColor="text1" w:themeTint="A6"/>
+      <w:color w:val="D9D9D9" w:themeColor="text1" w:themeTint="A6"/>
       <w:spacing w:val="15"/>
       <w:sz w:val="28"/>
       <w:szCs w:val="28"/>
@@ -1697,7 +1684,7 @@
     <w:rPr>
       <w:i/>
       <w:iCs/>
-      <w:color w:val="404040" w:themeColor="text1" w:themeTint="BF"/>
+      <w:color w:val="D4D4D4" w:themeColor="text1" w:themeTint="BF"/>
     </w:rPr>
   </w:style>
   <w:style w:type="character" w:customStyle="1" w:styleId="QuoteChar">
@@ -1709,7 +1696,7 @@
     <w:rPr>
       <w:i/>
       <w:iCs/>
-      <w:color w:val="404040" w:themeColor="text1" w:themeTint="BF"/>
+      <w:color w:val="D4D4D4" w:themeColor="text1" w:themeTint="BF"/>
     </w:rPr>
   </w:style>
   <w:style w:type="paragraph" w:styleId="ListParagraph">
@@ -1792,10 +1779,10 @@
   <a:themeElements>
     <a:clrScheme name="Office">
       <a:dk1>
-        <a:sysClr val="windowText" lastClr="000000"/>
+        <a:sysClr val="windowText" lastClr="C6C6C6"/>
       </a:dk1>
       <a:lt1>
-        <a:sysClr val="window" lastClr="FFFFFF"/>
+        <a:sysClr val="window" lastClr="000000"/>
       </a:lt1>
       <a:dk2>
         <a:srgbClr val="44546A"/>

</xml_diff>